<commit_message>
docs(plantillas): actualizar numero y fecha de decreto en MODIFICACION_2_ACEPTACION
</commit_message>
<xml_diff>
--- a/plantillas/MODIFICACION_2_ACEPTACION.docx
+++ b/plantillas/MODIFICACION_2_ACEPTACION.docx
@@ -1562,7 +1562,39 @@
           <w:sz w:val="24"/>
           <w:szCs w:val="24"/>
         </w:rPr>
-        <w:t xml:space="preserve"> 28 de septiembre de 2016, en concordancia con el Decreto No. 4112.010.20.1025 de 2025 y</w:t>
+        <w:t xml:space="preserve"> 28 de septiembre de 2016, en concordancia con el Decreto No. 4112.010.20.</w:t>
+      </w:r>
+      <w:r>
+        <w:rPr>
+          <w:rFonts w:ascii="Arial" w:eastAsia="Arial" w:hAnsi="Arial" w:cs="Arial"/>
+          <w:sz w:val="24"/>
+          <w:szCs w:val="24"/>
+        </w:rPr>
+        <w:t>0780 del 24 de junio</w:t>
+      </w:r>
+      <w:r>
+        <w:rPr>
+          <w:rFonts w:ascii="Arial" w:eastAsia="Arial" w:hAnsi="Arial" w:cs="Arial"/>
+          <w:sz w:val="24"/>
+          <w:szCs w:val="24"/>
+        </w:rPr>
+        <w:t xml:space="preserve"> de 202</w:t>
+      </w:r>
+      <w:r>
+        <w:rPr>
+          <w:rFonts w:ascii="Arial" w:eastAsia="Arial" w:hAnsi="Arial" w:cs="Arial"/>
+          <w:sz w:val="24"/>
+          <w:szCs w:val="24"/>
+        </w:rPr>
+        <w:t>6</w:t>
+      </w:r>
+      <w:r>
+        <w:rPr>
+          <w:rFonts w:ascii="Arial" w:eastAsia="Arial" w:hAnsi="Arial" w:cs="Arial"/>
+          <w:sz w:val="24"/>
+          <w:szCs w:val="24"/>
+        </w:rPr>
+        <w:t xml:space="preserve"> y</w:t>
       </w:r>
       <w:r>
         <w:rPr>

</xml_diff>